<commit_message>
Calendar and exit ticket updates
</commit_message>
<xml_diff>
--- a/calendars/Sum2_26-Stat216_Calendar.docx
+++ b/calendars/Sum2_26-Stat216_Calendar.docx
@@ -1741,17 +1741,7 @@
                 <w:sz w:val="24"/>
                 <w:szCs w:val="24"/>
               </w:rPr>
-              <w:t>JULY 4 OBSERVATION</w:t>
-            </w:r>
-            <w:r>
-              <w:rPr>
-                <w:rFonts w:ascii="Times New Roman" w:hAnsi="Times New Roman" w:cs="Times New Roman"/>
-                <w:b/>
-                <w:bCs/>
-                <w:sz w:val="24"/>
-                <w:szCs w:val="24"/>
-              </w:rPr>
-              <w:t xml:space="preserve"> – NO CLASS, CAMPUS CLOSED</w:t>
+              <w:t>JULY 4 OBSERVATION –  CAMPUS CLOSED</w:t>
             </w:r>
           </w:p>
         </w:tc>
@@ -3183,20 +3173,8 @@
                 <w:sz w:val="24"/>
                 <w:szCs w:val="24"/>
               </w:rPr>
-              <w:t xml:space="preserve"> *Note the due date is Tuesday, not </w:t>
-            </w:r>
-            <w:proofErr w:type="gramStart"/>
-            <w:r>
-              <w:rPr>
-                <w:rFonts w:ascii="Times New Roman" w:hAnsi="Times New Roman" w:cs="Times New Roman"/>
-                <w:b/>
-                <w:color w:val="4472C4" w:themeColor="accent1"/>
-                <w:sz w:val="24"/>
-                <w:szCs w:val="24"/>
-              </w:rPr>
-              <w:t>Wednesday!*</w:t>
-            </w:r>
-            <w:proofErr w:type="gramEnd"/>
+              <w:t xml:space="preserve"> *Note the due date is Tuesday, not Wednesday!*</w:t>
+            </w:r>
           </w:p>
         </w:tc>
       </w:tr>
@@ -3731,16 +3709,7 @@
                 <w:sz w:val="24"/>
                 <w:szCs w:val="24"/>
               </w:rPr>
-              <w:t>70 – 1</w:t>
-            </w:r>
-            <w:r>
-              <w:rPr>
-                <w:rFonts w:ascii="Times New Roman" w:hAnsi="Times New Roman" w:cs="Times New Roman"/>
-                <w:color w:val="00B050"/>
-                <w:sz w:val="24"/>
-                <w:szCs w:val="24"/>
-              </w:rPr>
-              <w:t xml:space="preserve">79; </w:t>
+              <w:t xml:space="preserve">70 – 179; </w:t>
             </w:r>
             <w:r>
               <w:rPr>
@@ -3843,23 +3812,7 @@
                 <w:sz w:val="24"/>
                 <w:szCs w:val="24"/>
               </w:rPr>
-              <w:t xml:space="preserve">): (Act 15) </w:t>
-            </w:r>
-            <w:r>
-              <w:rPr>
-                <w:rFonts w:ascii="Times New Roman" w:hAnsi="Times New Roman" w:cs="Times New Roman"/>
-                <w:sz w:val="24"/>
-                <w:szCs w:val="24"/>
-              </w:rPr>
-              <w:t>Module 9: Two categorical variables – Theoretical Inference (Act 16</w:t>
-            </w:r>
-            <w:r>
-              <w:rPr>
-                <w:rFonts w:ascii="Times New Roman" w:hAnsi="Times New Roman" w:cs="Times New Roman"/>
-                <w:sz w:val="24"/>
-                <w:szCs w:val="24"/>
-              </w:rPr>
-              <w:t>)</w:t>
+              <w:t>): (Act 15) Module 9: Two categorical variables – Theoretical Inference (Act 16)</w:t>
             </w:r>
           </w:p>
         </w:tc>
@@ -4213,15 +4166,7 @@
                 <w:sz w:val="24"/>
                 <w:szCs w:val="24"/>
               </w:rPr>
-              <w:t>Module 9</w:t>
-            </w:r>
-            <w:r>
-              <w:rPr>
-                <w:rFonts w:ascii="Times New Roman" w:hAnsi="Times New Roman" w:cs="Times New Roman"/>
-                <w:sz w:val="24"/>
-                <w:szCs w:val="24"/>
-              </w:rPr>
-              <w:t xml:space="preserve"> (</w:t>
+              <w:t>Module 9 (</w:t>
             </w:r>
             <w:proofErr w:type="spellStart"/>
             <w:r>
@@ -4312,49 +4257,7 @@
                 <w:sz w:val="24"/>
                 <w:szCs w:val="24"/>
               </w:rPr>
-              <w:t xml:space="preserve">Module 11: Quantitative Response across Independent Groups – </w:t>
-            </w:r>
-            <w:proofErr w:type="gramStart"/>
-            <w:r>
-              <w:rPr>
-                <w:rFonts w:ascii="Times New Roman" w:hAnsi="Times New Roman" w:cs="Times New Roman"/>
-                <w:sz w:val="24"/>
-                <w:szCs w:val="24"/>
-              </w:rPr>
-              <w:t xml:space="preserve">EDA </w:t>
-            </w:r>
-            <w:r>
-              <w:rPr>
-                <w:rFonts w:ascii="Times New Roman" w:hAnsi="Times New Roman" w:cs="Times New Roman"/>
-                <w:sz w:val="24"/>
-                <w:szCs w:val="24"/>
-              </w:rPr>
-              <w:t xml:space="preserve"> </w:t>
-            </w:r>
-            <w:r>
-              <w:rPr>
-                <w:rFonts w:ascii="Times New Roman" w:hAnsi="Times New Roman" w:cs="Times New Roman"/>
-                <w:sz w:val="24"/>
-                <w:szCs w:val="24"/>
-              </w:rPr>
-              <w:t>(</w:t>
-            </w:r>
-            <w:proofErr w:type="gramEnd"/>
-            <w:r>
-              <w:rPr>
-                <w:rFonts w:ascii="Times New Roman" w:hAnsi="Times New Roman" w:cs="Times New Roman"/>
-                <w:sz w:val="24"/>
-                <w:szCs w:val="24"/>
-              </w:rPr>
-              <w:t>Act 17</w:t>
-            </w:r>
-            <w:r>
-              <w:rPr>
-                <w:rFonts w:ascii="Times New Roman" w:hAnsi="Times New Roman" w:cs="Times New Roman"/>
-                <w:sz w:val="24"/>
-                <w:szCs w:val="24"/>
-              </w:rPr>
-              <w:t>)</w:t>
+              <w:t>Module 11: Quantitative Response across Independent Groups – EDA  (Act 17)</w:t>
             </w:r>
           </w:p>
         </w:tc>
@@ -4434,25 +4337,7 @@
                 <w:sz w:val="24"/>
                 <w:szCs w:val="24"/>
               </w:rPr>
-              <w:t>25</w:t>
-            </w:r>
-            <w:r>
-              <w:rPr>
-                <w:rFonts w:ascii="Times New Roman" w:hAnsi="Times New Roman" w:cs="Times New Roman"/>
-                <w:color w:val="00B050"/>
-                <w:sz w:val="24"/>
-                <w:szCs w:val="24"/>
-              </w:rPr>
-              <w:t>3</w:t>
-            </w:r>
-            <w:r>
-              <w:rPr>
-                <w:rFonts w:ascii="Times New Roman" w:hAnsi="Times New Roman" w:cs="Times New Roman"/>
-                <w:color w:val="00B050"/>
-                <w:sz w:val="24"/>
-                <w:szCs w:val="24"/>
-              </w:rPr>
-              <w:t xml:space="preserve"> – 258 </w:t>
+              <w:t xml:space="preserve">253 – 258 </w:t>
             </w:r>
           </w:p>
           <w:p>
@@ -4655,15 +4540,7 @@
                 <w:sz w:val="24"/>
                 <w:szCs w:val="24"/>
               </w:rPr>
-              <w:t>Module 11</w:t>
-            </w:r>
-            <w:r>
-              <w:rPr>
-                <w:rFonts w:ascii="Times New Roman" w:hAnsi="Times New Roman" w:cs="Times New Roman"/>
-                <w:sz w:val="24"/>
-                <w:szCs w:val="24"/>
-              </w:rPr>
-              <w:t xml:space="preserve"> (</w:t>
+              <w:t>Module 11 (</w:t>
             </w:r>
             <w:proofErr w:type="spellStart"/>
             <w:r>
@@ -4681,31 +4558,7 @@
                 <w:sz w:val="24"/>
                 <w:szCs w:val="24"/>
               </w:rPr>
-              <w:t>)</w:t>
-            </w:r>
-            <w:r>
-              <w:rPr>
-                <w:rFonts w:ascii="Times New Roman" w:hAnsi="Times New Roman" w:cs="Times New Roman"/>
-                <w:sz w:val="24"/>
-                <w:szCs w:val="24"/>
-              </w:rPr>
-              <w:t>: Quantitative Response across Independent Groups –</w:t>
-            </w:r>
-            <w:r>
-              <w:rPr>
-                <w:rFonts w:ascii="Times New Roman" w:hAnsi="Times New Roman" w:cs="Times New Roman"/>
-                <w:sz w:val="24"/>
-                <w:szCs w:val="24"/>
-              </w:rPr>
-              <w:t xml:space="preserve"> </w:t>
-            </w:r>
-            <w:r>
-              <w:rPr>
-                <w:rFonts w:ascii="Times New Roman" w:hAnsi="Times New Roman" w:cs="Times New Roman"/>
-                <w:sz w:val="24"/>
-                <w:szCs w:val="24"/>
-              </w:rPr>
-              <w:t>Inference (</w:t>
+              <w:t>): Quantitative Response across Independent Groups – Inference (</w:t>
             </w:r>
             <w:r>
               <w:rPr>
@@ -5246,23 +5099,7 @@
                 <w:sz w:val="24"/>
                 <w:szCs w:val="24"/>
               </w:rPr>
-              <w:t xml:space="preserve">): </w:t>
-            </w:r>
-            <w:r>
-              <w:rPr>
-                <w:rFonts w:ascii="Times New Roman" w:hAnsi="Times New Roman" w:cs="Times New Roman"/>
-                <w:sz w:val="24"/>
-                <w:szCs w:val="24"/>
-              </w:rPr>
-              <w:t>Two Quantitative Variables –Inference</w:t>
-            </w:r>
-            <w:r>
-              <w:rPr>
-                <w:rFonts w:ascii="Times New Roman" w:hAnsi="Times New Roman" w:cs="Times New Roman"/>
-                <w:sz w:val="24"/>
-                <w:szCs w:val="24"/>
-              </w:rPr>
-              <w:t xml:space="preserve"> (Act 21, </w:t>
+              <w:t xml:space="preserve">): Two Quantitative Variables –Inference (Act 21, </w:t>
             </w:r>
             <w:r>
               <w:rPr>
@@ -5335,26 +5172,17 @@
                 <w:sz w:val="24"/>
                 <w:szCs w:val="24"/>
               </w:rPr>
-              <w:t xml:space="preserve">Ch21_Overview; </w:t>
-            </w:r>
-            <w:r>
+              <w:t>Ch21_Overview; 21.1; 21.3; 21.4TheoryTests; 21.4TheoryIntervals</w:t>
+            </w:r>
+          </w:p>
+          <w:p>
+            <w:pPr>
               <w:rPr>
                 <w:rFonts w:ascii="Times New Roman" w:hAnsi="Times New Roman" w:cs="Times New Roman"/>
                 <w:color w:val="FF0000"/>
                 <w:sz w:val="24"/>
                 <w:szCs w:val="24"/>
               </w:rPr>
-              <w:t>21.1; 21.3; 21.4TheoryTests; 21.4TheoryIntervals</w:t>
-            </w:r>
-          </w:p>
-          <w:p>
-            <w:pPr>
-              <w:rPr>
-                <w:rFonts w:ascii="Times New Roman" w:hAnsi="Times New Roman" w:cs="Times New Roman"/>
-                <w:color w:val="FF0000"/>
-                <w:sz w:val="24"/>
-                <w:szCs w:val="24"/>
-              </w:rPr>
             </w:pPr>
             <w:r>
               <w:rPr>
@@ -5372,16 +5200,7 @@
                 <w:sz w:val="24"/>
                 <w:szCs w:val="24"/>
               </w:rPr>
-              <w:t>2</w:t>
-            </w:r>
-            <w:r>
-              <w:rPr>
-                <w:rFonts w:ascii="Times New Roman" w:hAnsi="Times New Roman" w:cs="Times New Roman"/>
-                <w:color w:val="00B050"/>
-                <w:sz w:val="24"/>
-                <w:szCs w:val="24"/>
-              </w:rPr>
-              <w:t xml:space="preserve">88 – 297 </w:t>
+              <w:t xml:space="preserve">288 – 297 </w:t>
             </w:r>
           </w:p>
         </w:tc>
@@ -5590,31 +5409,7 @@
                 <w:sz w:val="24"/>
                 <w:szCs w:val="24"/>
               </w:rPr>
-              <w:t>Module 1</w:t>
-            </w:r>
-            <w:r>
-              <w:rPr>
-                <w:rFonts w:ascii="Times New Roman" w:hAnsi="Times New Roman" w:cs="Times New Roman"/>
-                <w:sz w:val="24"/>
-                <w:szCs w:val="24"/>
-              </w:rPr>
-              <w:t>3</w:t>
-            </w:r>
-            <w:r>
-              <w:rPr>
-                <w:rFonts w:ascii="Times New Roman" w:hAnsi="Times New Roman" w:cs="Times New Roman"/>
-                <w:sz w:val="24"/>
-                <w:szCs w:val="24"/>
-              </w:rPr>
-              <w:t xml:space="preserve">: Paired Data – EDA and Inference (Act </w:t>
-            </w:r>
-            <w:r>
-              <w:rPr>
-                <w:rFonts w:ascii="Times New Roman" w:hAnsi="Times New Roman" w:cs="Times New Roman"/>
-                <w:sz w:val="24"/>
-                <w:szCs w:val="24"/>
-              </w:rPr>
-              <w:t xml:space="preserve">22, Act 23, </w:t>
+              <w:t xml:space="preserve">Module 13: Paired Data – EDA and Inference (Act 22, Act 23, </w:t>
             </w:r>
             <w:r>
               <w:rPr>

</xml_diff>